<commit_message>
Update documents and scripts following the April 2026 V7 reruns and May 2026 low-data confirmation. Key changes include:
- Revised operational handoff and master plan documents to reflect current budget and project status.
- Updated publication strategy and submission benchmark documents to clarify claims and results, emphasizing classical baselines and low-data competitiveness signals.
- Added a new submission packet document summarizing shareable materials and evidence files.
- Enhanced the low-data aggregation script to prevent overwriting confirmed summary rows with local-only pilot data, ensuring integrity of results.
</commit_message>
<xml_diff>
--- a/docs/ADVISOR_UPDATE_2026-03-25_TR.docx
+++ b/docs/ADVISOR_UPDATE_2026-03-25_TR.docx
@@ -2,7 +2,7 @@
 <file path=word/document.xml><?xml version="1.0" encoding="utf-8"?>
 <w:document xmlns:w="http://schemas.openxmlformats.org/wordprocessingml/2006/main" xmlns:m="http://schemas.openxmlformats.org/officeDocument/2006/math" xmlns:r="http://schemas.openxmlformats.org/officeDocument/2006/relationships" xmlns:o="urn:schemas-microsoft-com:office:office" xmlns:v="urn:schemas-microsoft-com:vml" xmlns:w10="urn:schemas-microsoft-com:office:word" xmlns:a="http://schemas.openxmlformats.org/drawingml/2006/main" xmlns:pic="http://schemas.openxmlformats.org/drawingml/2006/picture" xmlns:wp="http://schemas.openxmlformats.org/drawingml/2006/wordprocessingDrawing">
   <w:body>
-    <w:bookmarkStart w:id="20" w:name="danışman-güncellemesi"/>
+    <w:bookmarkStart w:id="22" w:name="danışman-güncellemesi"/>
     <w:p>
       <w:pPr>
         <w:pStyle w:val="Heading1"/>
@@ -26,7 +26,7 @@
         <w:t xml:space="preserve"> </w:t>
       </w:r>
       <w:r>
-        <w:t xml:space="preserve">25 Mart 2026</w:t>
+        <w:t xml:space="preserve">16 Mayıs 2026</w:t>
       </w:r>
     </w:p>
     <w:p>
@@ -34,7 +34,7 @@
         <w:pStyle w:val="BodyText"/>
       </w:pPr>
       <w:r>
-        <w:t xml:space="preserve">Bu not, çalışmanın tezden makaleye geçiş sürecindeki mevcut durumunu kısa ve gönderilebilir bir formatta özetlemek için hazırlanmıştır.</w:t>
+        <w:t xml:space="preserve">Bu not, çalışmanın tezden makaleye geçiş sürecindeki mevcut durumunu kısa ve gönderilebilir bir formatta özetlemek için güncellenmiştir.</w:t>
       </w:r>
     </w:p>
     <w:bookmarkStart w:id="9" w:name="X5558bc52e06ac82f7f07577bbef8aaf2712bb87"/>
@@ -103,7 +103,7 @@
         <w:pStyle w:val="FirstParagraph"/>
       </w:pPr>
       <w:r>
-        <w:t xml:space="preserve">Makale yönünde yapılan şey, tezi reddetmek değil; tezin bulgularını daha güçlü deney disiplini, çoklu seed, ayrı benchmark aileleri ve daha açık mühendislik analizi ile genişletmektir.</w:t>
+        <w:t xml:space="preserve">Makale yönünde yapılan şey, tezi reddetmek değil; tezin bulgularını daha güçlü deney disiplini, çoklu seed, ayrı benchmark aileleri, düşük-veri ölçekleme kontrolü ve daha açık mühendislik analizi ile genişletmektir.</w:t>
       </w:r>
     </w:p>
     <w:bookmarkEnd w:id="9"/>
@@ -264,6 +264,39 @@
     </w:p>
     <w:p>
       <w:pPr>
+        <w:pStyle w:val="Compact"/>
+        <w:numPr>
+          <w:ilvl w:val="1"/>
+          <w:numId w:val="1003"/>
+        </w:numPr>
+      </w:pPr>
+      <w:r>
+        <w:t xml:space="preserve">Mayıs 2026 düşük-veri ölçekleme doğrulaması</w:t>
+      </w:r>
+    </w:p>
+    <w:p>
+      <w:pPr>
+        <w:pStyle w:val="Compact"/>
+        <w:numPr>
+          <w:ilvl w:val="1"/>
+          <w:numId w:val="1003"/>
+        </w:numPr>
+      </w:pPr>
+      <w:r>
+        <w:t xml:space="preserve">modern classical upper-bound kontrolü (</w:t>
+      </w:r>
+      <w:r>
+        <w:rPr>
+          <w:rStyle w:val="VerbatimChar"/>
+        </w:rPr>
+        <w:t xml:space="preserve">resnet18_cifar_gray</w:t>
+      </w:r>
+      <w:r>
+        <w:t xml:space="preserve">)</w:t>
+      </w:r>
+    </w:p>
+    <w:p>
+      <w:pPr>
         <w:numPr>
           <w:ilvl w:val="0"/>
           <w:numId w:val="1002"/>
@@ -316,6 +349,30 @@
         </w:numPr>
       </w:pPr>
       <w:r>
+        <w:t xml:space="preserve">modern classical upper bound,</w:t>
+      </w:r>
+    </w:p>
+    <w:p>
+      <w:pPr>
+        <w:pStyle w:val="Compact"/>
+        <w:numPr>
+          <w:ilvl w:val="1"/>
+          <w:numId w:val="1004"/>
+        </w:numPr>
+      </w:pPr>
+      <w:r>
+        <w:t xml:space="preserve">düşük-veri ölçekleme,</w:t>
+      </w:r>
+    </w:p>
+    <w:p>
+      <w:pPr>
+        <w:pStyle w:val="Compact"/>
+        <w:numPr>
+          <w:ilvl w:val="1"/>
+          <w:numId w:val="1004"/>
+        </w:numPr>
+      </w:pPr>
+      <w:r>
         <w:t xml:space="preserve">trainable-quantum engineering case-study</w:t>
       </w:r>
       <w:r>
@@ -334,7 +391,7 @@
       </w:r>
     </w:p>
     <w:bookmarkEnd w:id="10"/>
-    <w:bookmarkStart w:id="14" w:name="X749eb894a82853dae712e8ffe9cdb003dd8fcce"/>
+    <w:bookmarkStart w:id="16" w:name="X749eb894a82853dae712e8ffe9cdb003dd8fcce"/>
     <w:p>
       <w:pPr>
         <w:pStyle w:val="Heading2"/>
@@ -805,13 +862,13 @@
       </w:tr>
     </w:tbl>
     <w:bookmarkEnd w:id="12"/>
-    <w:bookmarkStart w:id="13" w:name="X0147274ea514ac90b1df0bc43399a964c6f8e5a"/>
+    <w:bookmarkStart w:id="13" w:name="Xe26b89e38e1b7a457b0f98601e63cd4d9c4c0e5"/>
     <w:p>
       <w:pPr>
         <w:pStyle w:val="Heading3"/>
       </w:pPr>
       <w:r>
-        <w:t xml:space="preserve">3.3 Trainable quantum case-study</w:t>
+        <w:t xml:space="preserve">3.3 Modern classical üst sınır</w:t>
       </w:r>
     </w:p>
     <w:tbl>
@@ -846,9 +903,10 @@
           <w:p>
             <w:pPr>
               <w:pStyle w:val="Compact"/>
-            </w:pPr>
-            <w:r>
-              <w:t xml:space="preserve">Durum</w:t>
+              <w:jc w:val="right"/>
+            </w:pPr>
+            <w:r>
+              <w:t xml:space="preserve">Çalıştırma Sayısı</w:t>
             </w:r>
           </w:p>
         </w:tc>
@@ -887,49 +945,685 @@
               <w:rPr>
                 <w:rStyle w:val="VerbatimChar"/>
               </w:rPr>
-              <w:t xml:space="preserve">V7 trainable quantum</w:t>
-            </w:r>
-          </w:p>
-        </w:tc>
-        <w:tc>
-          <w:tcPr/>
-          <w:p>
-            <w:pPr>
-              <w:pStyle w:val="Compact"/>
-            </w:pPr>
-            <w:r>
-              <w:t xml:space="preserve">dokümante</w:t>
-            </w:r>
-          </w:p>
-        </w:tc>
-        <w:tc>
-          <w:tcPr/>
-          <w:p>
-            <w:pPr>
-              <w:pStyle w:val="Compact"/>
-              <w:jc w:val="right"/>
-            </w:pPr>
-            <w:r>
-              <w:t xml:space="preserve">65.02</w:t>
-            </w:r>
-          </w:p>
-        </w:tc>
-        <w:tc>
-          <w:tcPr/>
-          <w:p>
-            <w:pPr>
-              <w:pStyle w:val="Compact"/>
-            </w:pPr>
-            <w:r>
-              <w:t xml:space="preserve">benchmark lideri değil; mühendislik ve stabilizasyon sonucu</w:t>
+              <w:t xml:space="preserve">resnet18_cifar_gray</w:t>
+            </w:r>
+          </w:p>
+        </w:tc>
+        <w:tc>
+          <w:tcPr/>
+          <w:p>
+            <w:pPr>
+              <w:pStyle w:val="Compact"/>
+              <w:jc w:val="right"/>
+            </w:pPr>
+            <w:r>
+              <w:t xml:space="preserve">3</w:t>
+            </w:r>
+          </w:p>
+        </w:tc>
+        <w:tc>
+          <w:tcPr/>
+          <w:p>
+            <w:pPr>
+              <w:pStyle w:val="Compact"/>
+              <w:jc w:val="right"/>
+            </w:pPr>
+            <w:r>
+              <w:rPr>
+                <w:b/>
+                <w:bCs/>
+              </w:rPr>
+              <w:t xml:space="preserve">88.13 ± 0.82</w:t>
+            </w:r>
+          </w:p>
+        </w:tc>
+        <w:tc>
+          <w:tcPr/>
+          <w:p>
+            <w:pPr>
+              <w:pStyle w:val="Compact"/>
+            </w:pPr>
+            <w:r>
+              <w:t xml:space="preserve">aynı split üzerinde güçlü modern classical upper bound</w:t>
             </w:r>
           </w:p>
         </w:tc>
       </w:tr>
     </w:tbl>
     <w:bookmarkEnd w:id="13"/>
+    <w:bookmarkStart w:id="14" w:name="X64ba63154cfb018afffb33c4a22a25018934b15"/>
+    <w:p>
+      <w:pPr>
+        <w:pStyle w:val="Heading3"/>
+      </w:pPr>
+      <w:r>
+        <w:t xml:space="preserve">3.4 Düşük-veri ölçekleme</w:t>
+      </w:r>
+    </w:p>
+    <w:p>
+      <w:pPr>
+        <w:pStyle w:val="FirstParagraph"/>
+      </w:pPr>
+      <w:r>
+        <w:t xml:space="preserve">Mayıs 2026 doğrulaması, current-local ailede</w:t>
+      </w:r>
+      <w:r>
+        <w:t xml:space="preserve"> </w:t>
+      </w:r>
+      <w:r>
+        <w:rPr>
+          <w:rStyle w:val="VerbatimChar"/>
+        </w:rPr>
+        <w:t xml:space="preserve">classical_conv</w:t>
+      </w:r>
+      <w:r>
+        <w:t xml:space="preserve"> </w:t>
+      </w:r>
+      <w:r>
+        <w:t xml:space="preserve">ile</w:t>
+      </w:r>
+      <w:r>
+        <w:t xml:space="preserve"> </w:t>
+      </w:r>
+      <w:r>
+        <w:rPr>
+          <w:rStyle w:val="VerbatimChar"/>
+        </w:rPr>
+        <w:t xml:space="preserve">non_trainable_quantum</w:t>
+      </w:r>
+      <w:r>
+        <w:t xml:space="preserve"> </w:t>
+      </w:r>
+      <w:r>
+        <w:t xml:space="preserve">modelini 10%, 25%, 50% ve 100% train fraction seviyelerinde karşılaştırdı. Seed 42/43/44 ortalamalarında</w:t>
+      </w:r>
+      <w:r>
+        <w:t xml:space="preserve"> </w:t>
+      </w:r>
+      <w:r>
+        <w:rPr>
+          <w:rStyle w:val="VerbatimChar"/>
+        </w:rPr>
+        <w:t xml:space="preserve">non_trainable_quantum</w:t>
+      </w:r>
+      <w:r>
+        <w:t xml:space="preserve"> </w:t>
+      </w:r>
+      <w:r>
+        <w:t xml:space="preserve">bu dört noktada da</w:t>
+      </w:r>
+      <w:r>
+        <w:t xml:space="preserve"> </w:t>
+      </w:r>
+      <w:r>
+        <w:rPr>
+          <w:rStyle w:val="VerbatimChar"/>
+        </w:rPr>
+        <w:t xml:space="preserve">classical_conv</w:t>
+      </w:r>
+      <w:r>
+        <w:t xml:space="preserve"> </w:t>
+      </w:r>
+      <w:r>
+        <w:t xml:space="preserve">üzerinde kaldı:</w:t>
+      </w:r>
+    </w:p>
+    <w:tbl>
+      <w:tblPr>
+        <w:tblStyle w:val="Table"/>
+        <w:tblW w:type="auto" w:w="0"/>
+        <w:tblLook w:firstRow="1" w:lastRow="0" w:firstColumn="0" w:lastColumn="0" w:noHBand="0" w:noVBand="0" w:val="0020"/>
+      </w:tblPr>
+      <w:tblGrid>
+        <w:gridCol w:w="1980"/>
+        <w:gridCol w:w="1980"/>
+        <w:gridCol w:w="1980"/>
+        <w:gridCol w:w="1980"/>
+      </w:tblGrid>
+      <w:tr>
+        <w:trPr>
+          <w:tblHeader w:val="on"/>
+        </w:trPr>
+        <w:tc>
+          <w:tcPr/>
+          <w:p>
+            <w:pPr>
+              <w:pStyle w:val="Compact"/>
+              <w:jc w:val="right"/>
+            </w:pPr>
+            <w:r>
+              <w:t xml:space="preserve">Fraction</w:t>
+            </w:r>
+          </w:p>
+        </w:tc>
+        <w:tc>
+          <w:tcPr/>
+          <w:p>
+            <w:pPr>
+              <w:pStyle w:val="Compact"/>
+              <w:jc w:val="right"/>
+            </w:pPr>
+            <w:r>
+              <w:rPr>
+                <w:rStyle w:val="VerbatimChar"/>
+              </w:rPr>
+              <w:t xml:space="preserve">classical_conv</w:t>
+            </w:r>
+            <w:r>
+              <w:t xml:space="preserve"> </w:t>
+            </w:r>
+            <w:r>
+              <w:t xml:space="preserve">Test</w:t>
+            </w:r>
+          </w:p>
+        </w:tc>
+        <w:tc>
+          <w:tcPr/>
+          <w:p>
+            <w:pPr>
+              <w:pStyle w:val="Compact"/>
+              <w:jc w:val="right"/>
+            </w:pPr>
+            <w:r>
+              <w:rPr>
+                <w:rStyle w:val="VerbatimChar"/>
+              </w:rPr>
+              <w:t xml:space="preserve">non_trainable_quantum</w:t>
+            </w:r>
+            <w:r>
+              <w:t xml:space="preserve"> </w:t>
+            </w:r>
+            <w:r>
+              <w:t xml:space="preserve">Test</w:t>
+            </w:r>
+          </w:p>
+        </w:tc>
+        <w:tc>
+          <w:tcPr/>
+          <w:p>
+            <w:pPr>
+              <w:pStyle w:val="Compact"/>
+            </w:pPr>
+            <w:r>
+              <w:t xml:space="preserve">Yorum</w:t>
+            </w:r>
+          </w:p>
+        </w:tc>
+      </w:tr>
+      <w:tr>
+        <w:tc>
+          <w:tcPr/>
+          <w:p>
+            <w:pPr>
+              <w:pStyle w:val="Compact"/>
+              <w:jc w:val="right"/>
+            </w:pPr>
+            <w:r>
+              <w:t xml:space="preserve">0.10</w:t>
+            </w:r>
+          </w:p>
+        </w:tc>
+        <w:tc>
+          <w:tcPr/>
+          <w:p>
+            <w:pPr>
+              <w:pStyle w:val="Compact"/>
+              <w:jc w:val="right"/>
+            </w:pPr>
+            <w:r>
+              <w:t xml:space="preserve">48.42 ± 2.31</w:t>
+            </w:r>
+          </w:p>
+        </w:tc>
+        <w:tc>
+          <w:tcPr/>
+          <w:p>
+            <w:pPr>
+              <w:pStyle w:val="Compact"/>
+              <w:jc w:val="right"/>
+            </w:pPr>
+            <w:r>
+              <w:rPr>
+                <w:b/>
+                <w:bCs/>
+              </w:rPr>
+              <w:t xml:space="preserve">50.71 ± 2.93</w:t>
+            </w:r>
+          </w:p>
+        </w:tc>
+        <w:tc>
+          <w:tcPr/>
+          <w:p>
+            <w:pPr>
+              <w:pStyle w:val="Compact"/>
+            </w:pPr>
+            <w:r>
+              <w:t xml:space="preserve">current-local quantum önde</w:t>
+            </w:r>
+          </w:p>
+        </w:tc>
+      </w:tr>
+      <w:tr>
+        <w:tc>
+          <w:tcPr/>
+          <w:p>
+            <w:pPr>
+              <w:pStyle w:val="Compact"/>
+              <w:jc w:val="right"/>
+            </w:pPr>
+            <w:r>
+              <w:t xml:space="preserve">0.25</w:t>
+            </w:r>
+          </w:p>
+        </w:tc>
+        <w:tc>
+          <w:tcPr/>
+          <w:p>
+            <w:pPr>
+              <w:pStyle w:val="Compact"/>
+              <w:jc w:val="right"/>
+            </w:pPr>
+            <w:r>
+              <w:t xml:space="preserve">66.24 ± 1.78</w:t>
+            </w:r>
+          </w:p>
+        </w:tc>
+        <w:tc>
+          <w:tcPr/>
+          <w:p>
+            <w:pPr>
+              <w:pStyle w:val="Compact"/>
+              <w:jc w:val="right"/>
+            </w:pPr>
+            <w:r>
+              <w:rPr>
+                <w:b/>
+                <w:bCs/>
+              </w:rPr>
+              <w:t xml:space="preserve">69.88 ± 0.99</w:t>
+            </w:r>
+          </w:p>
+        </w:tc>
+        <w:tc>
+          <w:tcPr/>
+          <w:p>
+            <w:pPr>
+              <w:pStyle w:val="Compact"/>
+            </w:pPr>
+            <w:r>
+              <w:t xml:space="preserve">current-local quantum önde</w:t>
+            </w:r>
+          </w:p>
+        </w:tc>
+      </w:tr>
+      <w:tr>
+        <w:tc>
+          <w:tcPr/>
+          <w:p>
+            <w:pPr>
+              <w:pStyle w:val="Compact"/>
+              <w:jc w:val="right"/>
+            </w:pPr>
+            <w:r>
+              <w:t xml:space="preserve">0.50</w:t>
+            </w:r>
+          </w:p>
+        </w:tc>
+        <w:tc>
+          <w:tcPr/>
+          <w:p>
+            <w:pPr>
+              <w:pStyle w:val="Compact"/>
+              <w:jc w:val="right"/>
+            </w:pPr>
+            <w:r>
+              <w:t xml:space="preserve">75.61 ± 1.02</w:t>
+            </w:r>
+          </w:p>
+        </w:tc>
+        <w:tc>
+          <w:tcPr/>
+          <w:p>
+            <w:pPr>
+              <w:pStyle w:val="Compact"/>
+              <w:jc w:val="right"/>
+            </w:pPr>
+            <w:r>
+              <w:rPr>
+                <w:b/>
+                <w:bCs/>
+              </w:rPr>
+              <w:t xml:space="preserve">76.75 ± 0.50</w:t>
+            </w:r>
+          </w:p>
+        </w:tc>
+        <w:tc>
+          <w:tcPr/>
+          <w:p>
+            <w:pPr>
+              <w:pStyle w:val="Compact"/>
+            </w:pPr>
+            <w:r>
+              <w:t xml:space="preserve">current-local quantum önde</w:t>
+            </w:r>
+          </w:p>
+        </w:tc>
+      </w:tr>
+      <w:tr>
+        <w:tc>
+          <w:tcPr/>
+          <w:p>
+            <w:pPr>
+              <w:pStyle w:val="Compact"/>
+              <w:jc w:val="right"/>
+            </w:pPr>
+            <w:r>
+              <w:t xml:space="preserve">1.00</w:t>
+            </w:r>
+          </w:p>
+        </w:tc>
+        <w:tc>
+          <w:tcPr/>
+          <w:p>
+            <w:pPr>
+              <w:pStyle w:val="Compact"/>
+              <w:jc w:val="right"/>
+            </w:pPr>
+            <w:r>
+              <w:t xml:space="preserve">80.47 ± 0.57</w:t>
+            </w:r>
+          </w:p>
+        </w:tc>
+        <w:tc>
+          <w:tcPr/>
+          <w:p>
+            <w:pPr>
+              <w:pStyle w:val="Compact"/>
+              <w:jc w:val="right"/>
+            </w:pPr>
+            <w:r>
+              <w:rPr>
+                <w:b/>
+                <w:bCs/>
+              </w:rPr>
+              <w:t xml:space="preserve">80.76 ± 0.99</w:t>
+            </w:r>
+          </w:p>
+        </w:tc>
+        <w:tc>
+          <w:tcPr/>
+          <w:p>
+            <w:pPr>
+              <w:pStyle w:val="Compact"/>
+            </w:pPr>
+            <w:r>
+              <w:t xml:space="preserve">current-local quantum çok dar farkla önde</w:t>
+            </w:r>
+          </w:p>
+        </w:tc>
+      </w:tr>
+    </w:tbl>
+    <w:p>
+      <w:pPr>
+        <w:pStyle w:val="BodyText"/>
+      </w:pPr>
+      <w:r>
+        <w:t xml:space="preserve">Bu sonuç yalnızca current-local matched-budget aile için dar bir düşük-veri rekabet sinyalidir. Tez-faithful düşük-veri pilotunda</w:t>
+      </w:r>
+      <w:r>
+        <w:t xml:space="preserve"> </w:t>
+      </w:r>
+      <w:r>
+        <w:rPr>
+          <w:rStyle w:val="VerbatimChar"/>
+        </w:rPr>
+        <w:t xml:space="preserve">thesis_cnniiii</w:t>
+      </w:r>
+      <w:r>
+        <w:t xml:space="preserve">,</w:t>
+      </w:r>
+      <w:r>
+        <w:t xml:space="preserve"> </w:t>
+      </w:r>
+      <w:r>
+        <w:rPr>
+          <w:rStyle w:val="VerbatimChar"/>
+        </w:rPr>
+        <w:t xml:space="preserve">thesis_hqnn2</w:t>
+      </w:r>
+      <w:r>
+        <w:t xml:space="preserve"> </w:t>
+      </w:r>
+      <w:r>
+        <w:t xml:space="preserve">modelinin önünde kalmaktadır.</w:t>
+      </w:r>
+    </w:p>
     <w:bookmarkEnd w:id="14"/>
-    <w:bookmarkStart w:id="15" w:name="X29eb7cbfb6f47dcb69bfa892717f0e92deccb6b"/>
+    <w:bookmarkStart w:id="15" w:name="X4d4c4082824c82e67938377d7f5a100e8a42cd0"/>
+    <w:p>
+      <w:pPr>
+        <w:pStyle w:val="Heading3"/>
+      </w:pPr>
+      <w:r>
+        <w:t xml:space="preserve">3.5 Trainable quantum case-study</w:t>
+      </w:r>
+    </w:p>
+    <w:tbl>
+      <w:tblPr>
+        <w:tblStyle w:val="Table"/>
+        <w:tblW w:type="auto" w:w="0"/>
+        <w:tblLook w:firstRow="1" w:lastRow="0" w:firstColumn="0" w:lastColumn="0" w:noHBand="0" w:noVBand="0" w:val="0020"/>
+      </w:tblPr>
+      <w:tblGrid>
+        <w:gridCol w:w="1980"/>
+        <w:gridCol w:w="1980"/>
+        <w:gridCol w:w="1980"/>
+        <w:gridCol w:w="1980"/>
+      </w:tblGrid>
+      <w:tr>
+        <w:trPr>
+          <w:tblHeader w:val="on"/>
+        </w:trPr>
+        <w:tc>
+          <w:tcPr/>
+          <w:p>
+            <w:pPr>
+              <w:pStyle w:val="Compact"/>
+            </w:pPr>
+            <w:r>
+              <w:t xml:space="preserve">Model</w:t>
+            </w:r>
+          </w:p>
+        </w:tc>
+        <w:tc>
+          <w:tcPr/>
+          <w:p>
+            <w:pPr>
+              <w:pStyle w:val="Compact"/>
+            </w:pPr>
+            <w:r>
+              <w:t xml:space="preserve">Durum</w:t>
+            </w:r>
+          </w:p>
+        </w:tc>
+        <w:tc>
+          <w:tcPr/>
+          <w:p>
+            <w:pPr>
+              <w:pStyle w:val="Compact"/>
+              <w:jc w:val="right"/>
+            </w:pPr>
+            <w:r>
+              <w:t xml:space="preserve">Test Sonucu</w:t>
+            </w:r>
+          </w:p>
+        </w:tc>
+        <w:tc>
+          <w:tcPr/>
+          <w:p>
+            <w:pPr>
+              <w:pStyle w:val="Compact"/>
+            </w:pPr>
+            <w:r>
+              <w:t xml:space="preserve">Yorum</w:t>
+            </w:r>
+          </w:p>
+        </w:tc>
+      </w:tr>
+      <w:tr>
+        <w:tc>
+          <w:tcPr/>
+          <w:p>
+            <w:pPr>
+              <w:pStyle w:val="Compact"/>
+            </w:pPr>
+            <w:r>
+              <w:rPr>
+                <w:rStyle w:val="VerbatimChar"/>
+              </w:rPr>
+              <w:t xml:space="preserve">V7_trainable_quantum_rerun</w:t>
+            </w:r>
+          </w:p>
+        </w:tc>
+        <w:tc>
+          <w:tcPr/>
+          <w:p>
+            <w:pPr>
+              <w:pStyle w:val="Compact"/>
+            </w:pPr>
+            <w:r>
+              <w:t xml:space="preserve">6 Nisan 2026 resumed Colab L4 rerun</w:t>
+            </w:r>
+          </w:p>
+        </w:tc>
+        <w:tc>
+          <w:tcPr/>
+          <w:p>
+            <w:pPr>
+              <w:pStyle w:val="Compact"/>
+              <w:jc w:val="right"/>
+            </w:pPr>
+            <w:r>
+              <w:t xml:space="preserve">72.53</w:t>
+            </w:r>
+          </w:p>
+        </w:tc>
+        <w:tc>
+          <w:tcPr/>
+          <w:p>
+            <w:pPr>
+              <w:pStyle w:val="Compact"/>
+            </w:pPr>
+            <w:r>
+              <w:t xml:space="preserve">benchmark lideri değil; mühendislik ve stabilizasyon sonucu</w:t>
+            </w:r>
+          </w:p>
+        </w:tc>
+      </w:tr>
+      <w:tr>
+        <w:tc>
+          <w:tcPr/>
+          <w:p>
+            <w:pPr>
+              <w:pStyle w:val="Compact"/>
+            </w:pPr>
+            <w:r>
+              <w:rPr>
+                <w:rStyle w:val="VerbatimChar"/>
+              </w:rPr>
+              <w:t xml:space="preserve">V7_trainable_quantum_clean_20260427</w:t>
+            </w:r>
+          </w:p>
+        </w:tc>
+        <w:tc>
+          <w:tcPr/>
+          <w:p>
+            <w:pPr>
+              <w:pStyle w:val="Compact"/>
+            </w:pPr>
+            <w:r>
+              <w:t xml:space="preserve">27-28 Nisan 2026 clean non-resumed Colab L4 rerun</w:t>
+            </w:r>
+          </w:p>
+        </w:tc>
+        <w:tc>
+          <w:tcPr/>
+          <w:p>
+            <w:pPr>
+              <w:pStyle w:val="Compact"/>
+              <w:jc w:val="right"/>
+            </w:pPr>
+            <w:r>
+              <w:t xml:space="preserve">65.88</w:t>
+            </w:r>
+          </w:p>
+        </w:tc>
+        <w:tc>
+          <w:tcPr/>
+          <w:p>
+            <w:pPr>
+              <w:pStyle w:val="Compact"/>
+            </w:pPr>
+            <w:r>
+              <w:t xml:space="preserve">notebook çıktısından yeniden inşa edilmiş JSON satırı; Drive'da checkpoint var, experiments metadata eksik</w:t>
+            </w:r>
+          </w:p>
+        </w:tc>
+      </w:tr>
+      <w:tr>
+        <w:tc>
+          <w:tcPr/>
+          <w:p>
+            <w:pPr>
+              <w:pStyle w:val="Compact"/>
+            </w:pPr>
+            <w:r>
+              <w:rPr>
+                <w:rStyle w:val="VerbatimChar"/>
+              </w:rPr>
+              <w:t xml:space="preserve">V7_trainable_quantum_documented</w:t>
+            </w:r>
+          </w:p>
+        </w:tc>
+        <w:tc>
+          <w:tcPr/>
+          <w:p>
+            <w:pPr>
+              <w:pStyle w:val="Compact"/>
+            </w:pPr>
+            <w:r>
+              <w:t xml:space="preserve">eski dokümante sonuç</w:t>
+            </w:r>
+          </w:p>
+        </w:tc>
+        <w:tc>
+          <w:tcPr/>
+          <w:p>
+            <w:pPr>
+              <w:pStyle w:val="Compact"/>
+              <w:jc w:val="right"/>
+            </w:pPr>
+            <w:r>
+              <w:t xml:space="preserve">65.02</w:t>
+            </w:r>
+          </w:p>
+        </w:tc>
+        <w:tc>
+          <w:tcPr/>
+          <w:p>
+            <w:pPr>
+              <w:pStyle w:val="Compact"/>
+            </w:pPr>
+            <w:r>
+              <w:t xml:space="preserve">tarihsel karşılaştırma satırı</w:t>
+            </w:r>
+          </w:p>
+        </w:tc>
+      </w:tr>
+    </w:tbl>
+    <w:bookmarkEnd w:id="15"/>
+    <w:bookmarkEnd w:id="16"/>
+    <w:bookmarkStart w:id="17" w:name="X29eb7cbfb6f47dcb69bfa892717f0e92deccb6b"/>
     <w:p>
       <w:pPr>
         <w:pStyle w:val="Heading2"/>
@@ -979,7 +1673,7 @@
         </w:numPr>
       </w:pPr>
       <w:r>
-        <w:t xml:space="preserve">Yayın değeri şu üç eksende oluşmaktadır:</w:t>
+        <w:t xml:space="preserve">Yayın değeri şu dört eksende oluşmaktadır:</w:t>
       </w:r>
     </w:p>
     <w:p>
@@ -1015,6 +1709,18 @@
         </w:numPr>
       </w:pPr>
       <w:r>
+        <w:t xml:space="preserve">current-local ailede dar düşük-veri rekabet sinyali,</w:t>
+      </w:r>
+    </w:p>
+    <w:p>
+      <w:pPr>
+        <w:pStyle w:val="Compact"/>
+        <w:numPr>
+          <w:ilvl w:val="1"/>
+          <w:numId w:val="1006"/>
+        </w:numPr>
+      </w:pPr>
+      <w:r>
         <w:t xml:space="preserve">hibrit quantum-classical eğitimde mühendislik dersleri.</w:t>
       </w:r>
     </w:p>
@@ -1042,8 +1748,8 @@
         <w:t xml:space="preserve">Başka deyişle tez "ilk araştırma katmanı", makale ise "daha yüksek ispat standardına sahip ikinci katman" olarak konumlanmaktadır.</w:t>
       </w:r>
     </w:p>
-    <w:bookmarkEnd w:id="15"/>
-    <w:bookmarkStart w:id="16" w:name="X2413ddae3c06cfd3f5ab2915973ee30baffc896"/>
+    <w:bookmarkEnd w:id="17"/>
+    <w:bookmarkStart w:id="18" w:name="X2413ddae3c06cfd3f5ab2915973ee30baffc896"/>
     <w:p>
       <w:pPr>
         <w:pStyle w:val="Heading2"/>
@@ -1113,6 +1819,18 @@
         </w:numPr>
       </w:pPr>
       <w:r>
+        <w:t xml:space="preserve">current-local düşük-veri sonucu dar ve doğru kapsamda kullanılır,</w:t>
+      </w:r>
+    </w:p>
+    <w:p>
+      <w:pPr>
+        <w:pStyle w:val="Compact"/>
+        <w:numPr>
+          <w:ilvl w:val="0"/>
+          <w:numId w:val="1007"/>
+        </w:numPr>
+      </w:pPr>
+      <w:r>
         <w:t xml:space="preserve">V7 hattı accuracy winner olarak değil, engineering contribution olarak sunulur.</w:t>
       </w:r>
     </w:p>
@@ -1124,8 +1842,8 @@
         <w:t xml:space="preserve">Bu yaklaşım, hem tezi değersizleştirmeden devam etmeyi sağlar hem de yayın için daha savunulabilir bir bilimsel anlatı kurar.</w:t>
       </w:r>
     </w:p>
-    <w:bookmarkEnd w:id="16"/>
-    <w:bookmarkStart w:id="17" w:name="X35028d7d96f3114ad2b32543a477c1b42b4d970"/>
+    <w:bookmarkEnd w:id="18"/>
+    <w:bookmarkStart w:id="19" w:name="X35028d7d96f3114ad2b32543a477c1b42b4d970"/>
     <w:p>
       <w:pPr>
         <w:pStyle w:val="Heading2"/>
@@ -1151,7 +1869,7 @@
         </w:numPr>
       </w:pPr>
       <w:r>
-        <w:t xml:space="preserve">makale metninin tamamını yeni benchmark hiyerarşisine göre yeniden yazmak,</w:t>
+        <w:t xml:space="preserve">makale, benchmark özetleri ve Word export'larını aynı Mayıs 2026 claim setinde tutmak,</w:t>
       </w:r>
     </w:p>
     <w:p>
@@ -1163,7 +1881,7 @@
         </w:numPr>
       </w:pPr>
       <w:r>
-        <w:t xml:space="preserve">gerekiyorsa Colab üzerinde V7 için bir confirmatory rerun almak,</w:t>
+        <w:t xml:space="preserve">submission/advisor paketini final hale getirmek,</w:t>
       </w:r>
     </w:p>
     <w:p>
@@ -1175,7 +1893,7 @@
         </w:numPr>
       </w:pPr>
       <w:r>
-        <w:t xml:space="preserve">en az bir güçlü modern classical baseline eklemeyi değerlendirmek,</w:t>
+        <w:t xml:space="preserve">V7 veya düşük-veri deneylerini varsayılan olarak tekrar koşmamak,</w:t>
       </w:r>
     </w:p>
     <w:p>
@@ -1187,11 +1905,11 @@
         </w:numPr>
       </w:pPr>
       <w:r>
-        <w:t xml:space="preserve">submission versiyonunda ana iddiayı "fair benchmark + engineering lessons" ekseninde sabitlemek.</w:t>
-      </w:r>
-    </w:p>
-    <w:bookmarkEnd w:id="17"/>
-    <w:bookmarkStart w:id="18" w:name="X2545b58ece12e7c528477534fafb969cc9f43f7"/>
+        <w:t xml:space="preserve">yalnızca reviewer-risk azaltıyorsa confidence interval/significance testi, ikinci dataset ya da robustness ekseni eklemeyi değerlendirmek.</w:t>
+      </w:r>
+    </w:p>
+    <w:bookmarkEnd w:id="19"/>
+    <w:bookmarkStart w:id="20" w:name="X2545b58ece12e7c528477534fafb969cc9f43f7"/>
     <w:p>
       <w:pPr>
         <w:pStyle w:val="Heading2"/>
@@ -1213,11 +1931,41 @@
         <w:pStyle w:val="BlockText"/>
       </w:pPr>
       <w:r>
-        <w:t xml:space="preserve">Hocam merhaba, tezden çıkan Osmanlı-Türkçesi karakter tanıma çalışmasını yayın odaklı biçimde yeniden yapılandırdım. Bu süreçte tezdeki ana modelleri daha sıkı ve yeniden üretilebilir bir protokol altında tekrar koştum; ayrıca yeni matched-budget classical ve quantum ablation'lar ekledim. Güncel sonuçlar, en güçlü mevcut kanıtın classical modeller lehine olduğunu gösteriyor; dolayısıyla çalışmayı artık "quantum advantage" iddiasıyla değil, "fair benchmark + hybrid QML engineering lessons" ekseninde konumluyorum. Bunu tezi boşa çıkaran bir durum olarak değil, tezin kurduğu problemi ve model ailesini daha yüksek ispat standardıyla genişleten bir ikinci aşama olarak değerlendiriyorum. İsterseniz güncel benchmark tablosunu ve revize makale iskeletini paylaşabilirim.</w:t>
-      </w:r>
-    </w:p>
-    <w:bookmarkEnd w:id="18"/>
-    <w:bookmarkStart w:id="19" w:name="X4c81cafb2abc2f124231992d9aa5b5f984ff1e2"/>
+        <w:t xml:space="preserve">Hocam merhaba, tezden çıkan Osmanlı-Türkçesi karakter tanıma çalışmasını yayın odaklı biçimde yeniden yapılandırdım. Tezdeki ana CNN/HQNN modellerini daha sıkı ve yeniden üretilebilir bir protokol altında tekrar koştum; ayrıca matched-budget classical/quantum ablation'lar, güçlü bir modern classical üst sınır ve düşük-veri ölçekleme kontrolü ekledim. Güncel tam-veri sonuçları en güçlü genel kanıtın classical modeller lehine olduğunu gösteriyor. Buna karşılık Mayıs 2026 düşük-veri doğrulamasında current-local</w:t>
+      </w:r>
+      <w:r>
+        <w:t xml:space="preserve"> </w:t>
+      </w:r>
+      <w:r>
+        <w:rPr>
+          <w:rStyle w:val="VerbatimChar"/>
+        </w:rPr>
+        <w:t xml:space="preserve">non_trainable_quantum</w:t>
+      </w:r>
+      <w:r>
+        <w:t xml:space="preserve"> </w:t>
+      </w:r>
+      <w:r>
+        <w:t xml:space="preserve">modeli,</w:t>
+      </w:r>
+      <w:r>
+        <w:t xml:space="preserve"> </w:t>
+      </w:r>
+      <w:r>
+        <w:rPr>
+          <w:rStyle w:val="VerbatimChar"/>
+        </w:rPr>
+        <w:t xml:space="preserve">classical_conv</w:t>
+      </w:r>
+      <w:r>
+        <w:t xml:space="preserve"> </w:t>
+      </w:r>
+      <w:r>
+        <w:t xml:space="preserve">karşısında 10/25/50/100% train fraction seviyelerinde dar ama tutarlı bir rekabet sinyali verdi. Bu nedenle çalışmayı "generic quantum advantage" iddiasıyla değil, "fair benchmark + scoped low-data signal + hybrid QML engineering lessons" ekseninde konumluyorum. Bunu tezi boşa çıkaran bir durum olarak değil, tezin kurduğu problemi ve model ailesini daha yüksek ispat standardıyla genişleten bir ikinci aşama olarak değerlendiriyorum. İsterseniz güncel benchmark tablosunu, düşük-veri figürünü ve revize makale taslağını paylaşabilirim.</w:t>
+      </w:r>
+    </w:p>
+    <w:bookmarkEnd w:id="20"/>
+    <w:bookmarkStart w:id="21" w:name="X4c81cafb2abc2f124231992d9aa5b5f984ff1e2"/>
     <w:p>
       <w:pPr>
         <w:pStyle w:val="Heading2"/>
@@ -1291,7 +2039,37 @@
         <w:rPr>
           <w:rStyle w:val="VerbatimChar"/>
         </w:rPr>
+        <w:t xml:space="preserve">docs/LOW_DATA_SUMMARY.md</w:t>
+      </w:r>
+    </w:p>
+    <w:p>
+      <w:pPr>
+        <w:pStyle w:val="Compact"/>
+        <w:numPr>
+          <w:ilvl w:val="0"/>
+          <w:numId w:val="1009"/>
+        </w:numPr>
+      </w:pPr>
+      <w:r>
+        <w:rPr>
+          <w:rStyle w:val="VerbatimChar"/>
+        </w:rPr>
         <w:t xml:space="preserve">paper/draft.md</w:t>
+      </w:r>
+    </w:p>
+    <w:p>
+      <w:pPr>
+        <w:pStyle w:val="Compact"/>
+        <w:numPr>
+          <w:ilvl w:val="0"/>
+          <w:numId w:val="1009"/>
+        </w:numPr>
+      </w:pPr>
+      <w:r>
+        <w:rPr>
+          <w:rStyle w:val="VerbatimChar"/>
+        </w:rPr>
+        <w:t xml:space="preserve">paper/figures/low_data_scaling.pdf</w:t>
       </w:r>
     </w:p>
     <w:p>
@@ -1309,8 +2087,8 @@
         <w:t xml:space="preserve">experiments/*.json</w:t>
       </w:r>
     </w:p>
-    <w:bookmarkEnd w:id="19"/>
-    <w:bookmarkEnd w:id="20"/>
+    <w:bookmarkEnd w:id="21"/>
+    <w:bookmarkEnd w:id="22"/>
     <w:sectPr>
       <w:footnotePr>
         <w:numRestart w:val="eachSect"/>

</xml_diff>